<commit_message>
Update Keba - Scanner de Phishing.docx
</commit_message>
<xml_diff>
--- a/Keba - Scanner de Phishing.docx
+++ b/Keba - Scanner de Phishing.docx
@@ -3465,69 +3465,6 @@
     </w:p>
     <w:p>
       <w:pPr>
-        <w:ind w:left="-15"/>
-      </w:pPr>
-      <w:r>
-        <w:t xml:space="preserve">O estudo da óptica geométrica é um dos pilares fundamentais da Física clássica, permitindo compreender como a luz se propaga e interage com materiais e superfícies. Desde as antigas civilizações grega e egípcia até os trabalhos pioneiros de Isaac Newton e Christiaan Huygens nos séculos XVII e XVIII, a investigação sobre o comportamento da luz evoluiu de observações empíricas para formulações matemáticas rigorosas. Nesse contexto, a Lei das Lentes constitui um dos resultados mais significativos da óptica geométrica, fornecendo a relação matemática que governa a formação de imagens por superfícies refratoras esféricas. </w:t>
-      </w:r>
-    </w:p>
-    <w:p>
-      <w:pPr>
-        <w:ind w:left="-15"/>
-      </w:pPr>
-      <w:r>
-        <w:t xml:space="preserve">A Lei das Lentes — também denominada equação dos fabricantes de lentes ou equação de Gauss — relaciona as posições do objeto e da imagem com a distância focal da lente, permitindo prever com exatidão a natureza, o tamanho e a posição da imagem formada. Sua aplicação é fundamental para o desenvolvimento de dispositivos ópticos como óculos, microscópios, telescópios, câmeras fotográficas e sistemas de visão computacional, demonstrando relevância tanto científica quanto tecnológica. </w:t>
-      </w:r>
-    </w:p>
-    <w:p>
-      <w:pPr>
-        <w:ind w:left="705" w:firstLine="0"/>
-      </w:pPr>
-      <w:r>
-        <w:t xml:space="preserve">A equação da Lei das Lentes na sua formulação clássica é expressa como: </w:t>
-      </w:r>
-    </w:p>
-    <w:p>
-      <w:pPr>
-        <w:jc w:val="center"/>
-        <w:rPr>
-          <w:i/>
-        </w:rPr>
-      </w:pPr>
-      <w:r>
-        <w:rPr>
-          <w:i/>
-        </w:rPr>
-        <w:t>1/f = 1/g + 1/b</w:t>
-      </w:r>
-    </w:p>
-    <w:p>
-      <w:pPr>
-        <w:ind w:left="10" w:hanging="10"/>
-        <w:jc w:val="right"/>
-      </w:pPr>
-      <w:r>
-        <w:t xml:space="preserve">onde f representa a distância focal da lente, g a distância do objeto à lente e b a </w:t>
-      </w:r>
-    </w:p>
-    <w:p>
-      <w:pPr>
-        <w:ind w:left="-15" w:firstLine="0"/>
-      </w:pPr>
-      <w:r>
-        <w:t xml:space="preserve">distância da imagem à lente. Esta relação, combinada com os princípios de refração de Snell-Descartes, fornece o embasamento teórico para toda a óptica instrumental moderna. </w:t>
-      </w:r>
-    </w:p>
-    <w:p>
-      <w:pPr>
-        <w:ind w:left="-15"/>
-      </w:pPr>
-      <w:r>
-        <w:t xml:space="preserve">No presente relatório, serão apresentados os resultados de cinco exercícios práticos realizados no laboratório de óptica, com o objetivo de verificar experimentalmente a validade da Lei das Lentes e determinar a distância focal de lentes convergentes e divergentes por diferentes métodos. Os experimentos foram conduzidos com auxílio de um banco óptico, utilizando uma lente convergente de distância focal nominal de 10 cm e uma lente divergente de −20 cm. </w:t>
-      </w:r>
-    </w:p>
-    <w:p>
-      <w:pPr>
         <w:pStyle w:val="Cabealho2"/>
         <w:spacing w:after="3" w:line="360" w:lineRule="auto"/>
         <w:ind w:left="-5"/>
@@ -3557,7 +3494,6 @@
       </w:pPr>
       <w:bookmarkStart w:id="2" w:name="_Toc229562389"/>
       <w:r>
-        <w:lastRenderedPageBreak/>
         <w:t>1.2 Problema de Pesquisa</w:t>
       </w:r>
       <w:bookmarkEnd w:id="2"/>
@@ -3716,6 +3652,7 @@
         <w:ind w:hanging="360"/>
       </w:pPr>
       <w:r>
+        <w:lastRenderedPageBreak/>
         <w:t xml:space="preserve">Determinar experimentalmente a distância focal de uma lente convergente pelo método de projeção no infinito, pela equação de Gauss e pelo método de Bessel. </w:t>
       </w:r>
     </w:p>
@@ -3745,50 +3682,11 @@
     </w:p>
     <w:p/>
     <w:p>
-      <w:r>
-        <w:t xml:space="preserve"> </w:t>
-      </w:r>
-    </w:p>
-    <w:p>
-      <w:pPr>
-        <w:pStyle w:val="Cabealho2"/>
-        <w:spacing w:after="3" w:line="360" w:lineRule="auto"/>
-        <w:ind w:left="-5"/>
-      </w:pPr>
-      <w:bookmarkStart w:id="6" w:name="_Toc229562393"/>
-      <w:r>
-        <w:lastRenderedPageBreak/>
-        <w:t>1.6 Importância do Estudo</w:t>
-      </w:r>
+      <w:pPr>
+        <w:jc w:val="left"/>
+      </w:pPr>
+      <w:bookmarkStart w:id="6" w:name="_GoBack"/>
       <w:bookmarkEnd w:id="6"/>
-      <w:r>
-        <w:t xml:space="preserve"> </w:t>
-      </w:r>
-    </w:p>
-    <w:p>
-      <w:pPr>
-        <w:ind w:left="-15"/>
-      </w:pPr>
-      <w:r>
-        <w:t xml:space="preserve">O estudo experimental da Lei das Lentes possui importância formativa e científica de primeira ordem. Do ponto de vista formativo, a prática laboratorial de óptica permite ao estudante não apenas confirmar a teoria aprendida nas aulas teóricas, mas também desenvolver habilidades essenciais de medição, análise de incertezas, interpretação crítica de resultados e trabalho colaborativo. O manuseio do banco óptico, a identificação das condições de formação de imagens nítidas e a aplicação rigorosa de métodos de cálculo são competências fundamentais para qualquer cientista ou engenheiro. </w:t>
-      </w:r>
-    </w:p>
-    <w:p>
-      <w:pPr>
-        <w:ind w:left="-15"/>
-      </w:pPr>
-      <w:r>
-        <w:t xml:space="preserve">Do ponto de vista aplicado, a Lei das Lentes é o fundamento teórico de toda a indústria óptica moderna. Desde a produção de lentes corretivas para deficiências visuais até o projeto de objetivas de alta resolução para microscopia eletrônica e telescópios espaciais, o domínio desta equação é indispensável. Conforme destacam Hecht (2017) e Tipler e Mosca (2015), os princípios ópticos aqui estudados permanecem absolutamente atuais, constituindo a base da fotônica, da instrumentação científica e dos sistemas de imagem digital utilizados em medicina, astronomia e comunicações. </w:t>
-      </w:r>
-    </w:p>
-    <w:p>
-      <w:pPr>
-        <w:ind w:left="2325" w:firstLine="0"/>
-        <w:jc w:val="left"/>
-      </w:pPr>
-      <w:r>
-        <w:t xml:space="preserve"> </w:t>
-      </w:r>
     </w:p>
     <w:p>
       <w:pPr>
@@ -13806,20 +13704,44 @@
     </w:p>
     <w:p>
       <w:pPr>
-        <w:pStyle w:val="Cabealho2"/>
-        <w:rPr>
-          <w:color w:val="auto"/>
-          <w:lang w:val="pt-PT"/>
-        </w:rPr>
-      </w:pPr>
-      <w:bookmarkStart w:id="23" w:name="_Toc229562410"/>
-      <w:r>
-        <w:rPr>
-          <w:rFonts w:eastAsia="Arial"/>
+        <w:spacing w:after="160" w:line="278" w:lineRule="auto"/>
+        <w:ind w:firstLine="0"/>
+        <w:jc w:val="left"/>
+        <w:rPr>
+          <w:rFonts w:eastAsia="Arial"/>
+          <w:b/>
           <w:bCs/>
           <w:color w:val="auto"/>
           <w:lang w:val="pt-PT"/>
         </w:rPr>
+      </w:pPr>
+      <w:bookmarkStart w:id="23" w:name="_Toc229562410"/>
+      <w:r>
+        <w:rPr>
+          <w:rFonts w:eastAsia="Arial"/>
+          <w:bCs/>
+          <w:color w:val="auto"/>
+          <w:lang w:val="pt-PT"/>
+        </w:rPr>
+        <w:br w:type="page"/>
+      </w:r>
+    </w:p>
+    <w:p>
+      <w:pPr>
+        <w:pStyle w:val="Cabealho2"/>
+        <w:rPr>
+          <w:color w:val="auto"/>
+          <w:lang w:val="pt-PT"/>
+        </w:rPr>
+      </w:pPr>
+      <w:r>
+        <w:rPr>
+          <w:rFonts w:eastAsia="Arial"/>
+          <w:bCs/>
+          <w:color w:val="auto"/>
+          <w:lang w:val="pt-PT"/>
+        </w:rPr>
+        <w:lastRenderedPageBreak/>
         <w:t>8.1 Caminho dos Ficheiros no Código</w:t>
       </w:r>
       <w:bookmarkEnd w:id="23"/>
@@ -14139,14 +14061,12 @@
               <w:ind w:firstLine="0"/>
               <w:jc w:val="center"/>
             </w:pPr>
-            <w:bookmarkStart w:id="24" w:name="_GoBack" w:colFirst="0" w:colLast="1"/>
             <w:r>
               <w:rPr>
                 <w:rFonts w:ascii="Arial" w:eastAsia="Arial" w:hAnsi="Arial" w:cs="Arial"/>
                 <w:sz w:val="20"/>
                 <w:szCs w:val="20"/>
               </w:rPr>
-              <w:lastRenderedPageBreak/>
               <w:t>historico.txt</w:t>
             </w:r>
           </w:p>
@@ -14281,53 +14201,79 @@
         </w:tc>
       </w:tr>
     </w:tbl>
-    <w:bookmarkEnd w:id="24"/>
-    <w:p>
-      <w:pPr>
-        <w:pageBreakBefore/>
-        <w:rPr>
-          <w:lang w:val="pt-PT"/>
-        </w:rPr>
-      </w:pPr>
-      <w:r>
-        <w:rPr>
+    <w:p>
+      <w:pPr>
+        <w:pStyle w:val="Cabealho1"/>
+        <w:rPr>
+          <w:rFonts w:eastAsia="Arial"/>
+          <w:bCs/>
+          <w:color w:val="auto"/>
+          <w:szCs w:val="28"/>
+          <w:lang w:val="pt-PT"/>
+        </w:rPr>
+      </w:pPr>
+      <w:bookmarkStart w:id="24" w:name="_Toc229562411"/>
+    </w:p>
+    <w:p>
+      <w:pPr>
+        <w:spacing w:after="160" w:line="278" w:lineRule="auto"/>
+        <w:ind w:firstLine="0"/>
+        <w:jc w:val="left"/>
+        <w:rPr>
+          <w:rFonts w:eastAsia="Arial"/>
+          <w:b/>
+          <w:bCs/>
+          <w:color w:val="auto"/>
+          <w:sz w:val="28"/>
+          <w:szCs w:val="28"/>
+          <w:lang w:val="pt-PT"/>
+        </w:rPr>
+      </w:pPr>
+      <w:r>
+        <w:rPr>
+          <w:rFonts w:eastAsia="Arial"/>
+          <w:bCs/>
+          <w:color w:val="auto"/>
+          <w:szCs w:val="28"/>
+          <w:lang w:val="pt-PT"/>
+        </w:rPr>
+        <w:br w:type="page"/>
+      </w:r>
+    </w:p>
+    <w:p>
+      <w:pPr>
+        <w:pStyle w:val="Cabealho1"/>
+        <w:rPr>
+          <w:color w:val="auto"/>
+          <w:lang w:val="pt-PT"/>
+        </w:rPr>
+      </w:pPr>
+      <w:r>
+        <w:rPr>
+          <w:rFonts w:eastAsia="Arial"/>
+          <w:bCs/>
+          <w:color w:val="auto"/>
+          <w:szCs w:val="28"/>
           <w:lang w:val="pt-PT"/>
         </w:rPr>
         <w:lastRenderedPageBreak/>
-        <w:br/>
-      </w:r>
-    </w:p>
-    <w:p>
-      <w:pPr>
-        <w:pStyle w:val="Cabealho1"/>
-        <w:rPr>
-          <w:lang w:val="pt-PT"/>
-        </w:rPr>
-      </w:pPr>
-      <w:bookmarkStart w:id="25" w:name="_Toc229562411"/>
-      <w:r>
-        <w:rPr>
-          <w:rFonts w:ascii="Arial" w:eastAsia="Arial" w:hAnsi="Arial" w:cs="Arial"/>
-          <w:bCs/>
-          <w:color w:val="1F3864"/>
-          <w:szCs w:val="28"/>
-          <w:lang w:val="pt-PT"/>
-        </w:rPr>
         <w:t>9. Repositório GitHub</w:t>
       </w:r>
-      <w:bookmarkEnd w:id="25"/>
+      <w:bookmarkEnd w:id="24"/>
     </w:p>
     <w:p>
       <w:pPr>
         <w:spacing w:before="80" w:after="80"/>
         <w:ind w:firstLine="0"/>
         <w:rPr>
-          <w:lang w:val="pt-PT"/>
-        </w:rPr>
-      </w:pPr>
-      <w:r>
-        <w:rPr>
-          <w:rFonts w:ascii="Arial" w:eastAsia="Arial" w:hAnsi="Arial" w:cs="Arial"/>
+          <w:color w:val="auto"/>
+          <w:lang w:val="pt-PT"/>
+        </w:rPr>
+      </w:pPr>
+      <w:r>
+        <w:rPr>
+          <w:rFonts w:eastAsia="Arial"/>
+          <w:color w:val="auto"/>
           <w:sz w:val="22"/>
           <w:szCs w:val="22"/>
           <w:lang w:val="pt-PT"/>
@@ -14337,7 +14283,8 @@
       <w:proofErr w:type="spellStart"/>
       <w:r>
         <w:rPr>
-          <w:rFonts w:ascii="Arial" w:eastAsia="Arial" w:hAnsi="Arial" w:cs="Arial"/>
+          <w:rFonts w:eastAsia="Arial"/>
+          <w:color w:val="auto"/>
           <w:sz w:val="22"/>
           <w:szCs w:val="22"/>
           <w:lang w:val="pt-PT"/>
@@ -14347,7 +14294,8 @@
       <w:proofErr w:type="spellEnd"/>
       <w:r>
         <w:rPr>
-          <w:rFonts w:ascii="Arial" w:eastAsia="Arial" w:hAnsi="Arial" w:cs="Arial"/>
+          <w:rFonts w:eastAsia="Arial"/>
+          <w:color w:val="auto"/>
           <w:sz w:val="22"/>
           <w:szCs w:val="22"/>
           <w:lang w:val="pt-PT"/>
@@ -14357,7 +14305,8 @@
       <w:proofErr w:type="spellStart"/>
       <w:r>
         <w:rPr>
-          <w:rFonts w:ascii="Arial" w:eastAsia="Arial" w:hAnsi="Arial" w:cs="Arial"/>
+          <w:rFonts w:eastAsia="Arial"/>
+          <w:color w:val="auto"/>
           <w:sz w:val="22"/>
           <w:szCs w:val="22"/>
           <w:lang w:val="pt-PT"/>
@@ -14367,7 +14316,8 @@
       <w:proofErr w:type="spellEnd"/>
       <w:r>
         <w:rPr>
-          <w:rFonts w:ascii="Arial" w:eastAsia="Arial" w:hAnsi="Arial" w:cs="Arial"/>
+          <w:rFonts w:eastAsia="Arial"/>
+          <w:color w:val="auto"/>
           <w:sz w:val="22"/>
           <w:szCs w:val="22"/>
           <w:lang w:val="pt-PT"/>
@@ -14379,6 +14329,7 @@
       <w:pPr>
         <w:spacing w:before="80" w:after="80"/>
         <w:rPr>
+          <w:color w:val="auto"/>
           <w:lang w:val="pt-PT"/>
         </w:rPr>
       </w:pPr>
@@ -14389,15 +14340,16 @@
         <w:spacing w:before="120" w:after="120"/>
         <w:jc w:val="center"/>
         <w:rPr>
-          <w:lang w:val="pt-PT"/>
-        </w:rPr>
-      </w:pPr>
-      <w:r>
-        <w:rPr>
-          <w:rFonts w:ascii="Courier New" w:eastAsia="Courier New" w:hAnsi="Courier New" w:cs="Courier New"/>
+          <w:color w:val="auto"/>
+          <w:lang w:val="pt-PT"/>
+        </w:rPr>
+      </w:pPr>
+      <w:r>
+        <w:rPr>
+          <w:rFonts w:eastAsia="Courier New"/>
           <w:b/>
           <w:bCs/>
-          <w:color w:val="2980B9"/>
+          <w:color w:val="auto"/>
           <w:u w:val="single"/>
           <w:lang w:val="pt-PT"/>
         </w:rPr>
@@ -14408,6 +14360,7 @@
       <w:pPr>
         <w:spacing w:before="80" w:after="80"/>
         <w:rPr>
+          <w:color w:val="auto"/>
           <w:lang w:val="pt-PT"/>
         </w:rPr>
       </w:pPr>
@@ -14415,10 +14368,14 @@
     <w:p>
       <w:pPr>
         <w:spacing w:before="80" w:after="80"/>
-      </w:pPr>
-      <w:r>
-        <w:rPr>
-          <w:rFonts w:ascii="Arial" w:eastAsia="Arial" w:hAnsi="Arial" w:cs="Arial"/>
+        <w:rPr>
+          <w:color w:val="auto"/>
+        </w:rPr>
+      </w:pPr>
+      <w:r>
+        <w:rPr>
+          <w:rFonts w:eastAsia="Arial"/>
+          <w:color w:val="auto"/>
           <w:sz w:val="22"/>
           <w:szCs w:val="22"/>
         </w:rPr>
@@ -14436,12 +14393,14 @@
         <w:contextualSpacing w:val="0"/>
         <w:jc w:val="left"/>
         <w:rPr>
-          <w:lang w:val="pt-PT"/>
-        </w:rPr>
-      </w:pPr>
-      <w:r>
-        <w:rPr>
-          <w:rFonts w:ascii="Arial" w:eastAsia="Arial" w:hAnsi="Arial" w:cs="Arial"/>
+          <w:color w:val="auto"/>
+          <w:lang w:val="pt-PT"/>
+        </w:rPr>
+      </w:pPr>
+      <w:r>
+        <w:rPr>
+          <w:rFonts w:eastAsia="Arial"/>
+          <w:color w:val="auto"/>
           <w:sz w:val="22"/>
           <w:szCs w:val="22"/>
           <w:lang w:val="pt-PT"/>
@@ -14451,7 +14410,8 @@
       <w:proofErr w:type="spellStart"/>
       <w:r>
         <w:rPr>
-          <w:rFonts w:ascii="Arial" w:eastAsia="Arial" w:hAnsi="Arial" w:cs="Arial"/>
+          <w:rFonts w:eastAsia="Arial"/>
+          <w:color w:val="auto"/>
           <w:sz w:val="22"/>
           <w:szCs w:val="22"/>
           <w:lang w:val="pt-PT"/>
@@ -14461,7 +14421,8 @@
       <w:proofErr w:type="spellEnd"/>
       <w:r>
         <w:rPr>
-          <w:rFonts w:ascii="Arial" w:eastAsia="Arial" w:hAnsi="Arial" w:cs="Arial"/>
+          <w:rFonts w:eastAsia="Arial"/>
+          <w:color w:val="auto"/>
           <w:sz w:val="22"/>
           <w:szCs w:val="22"/>
           <w:lang w:val="pt-PT"/>
@@ -14480,12 +14441,14 @@
         <w:contextualSpacing w:val="0"/>
         <w:jc w:val="left"/>
         <w:rPr>
-          <w:lang w:val="pt-PT"/>
-        </w:rPr>
-      </w:pPr>
-      <w:r>
-        <w:rPr>
-          <w:rFonts w:ascii="Arial" w:eastAsia="Arial" w:hAnsi="Arial" w:cs="Arial"/>
+          <w:color w:val="auto"/>
+          <w:lang w:val="pt-PT"/>
+        </w:rPr>
+      </w:pPr>
+      <w:r>
+        <w:rPr>
+          <w:rFonts w:eastAsia="Arial"/>
+          <w:color w:val="auto"/>
           <w:sz w:val="22"/>
           <w:szCs w:val="22"/>
           <w:lang w:val="pt-PT"/>
@@ -14504,12 +14467,14 @@
         <w:contextualSpacing w:val="0"/>
         <w:jc w:val="left"/>
         <w:rPr>
-          <w:lang w:val="pt-PT"/>
-        </w:rPr>
-      </w:pPr>
-      <w:r>
-        <w:rPr>
-          <w:rFonts w:ascii="Arial" w:eastAsia="Arial" w:hAnsi="Arial" w:cs="Arial"/>
+          <w:color w:val="auto"/>
+          <w:lang w:val="pt-PT"/>
+        </w:rPr>
+      </w:pPr>
+      <w:r>
+        <w:rPr>
+          <w:rFonts w:eastAsia="Arial"/>
+          <w:color w:val="auto"/>
           <w:sz w:val="22"/>
           <w:szCs w:val="22"/>
           <w:lang w:val="pt-PT"/>
@@ -14528,12 +14493,14 @@
         <w:contextualSpacing w:val="0"/>
         <w:jc w:val="left"/>
         <w:rPr>
-          <w:lang w:val="pt-PT"/>
-        </w:rPr>
-      </w:pPr>
-      <w:r>
-        <w:rPr>
-          <w:rFonts w:ascii="Arial" w:eastAsia="Arial" w:hAnsi="Arial" w:cs="Arial"/>
+          <w:color w:val="auto"/>
+          <w:lang w:val="pt-PT"/>
+        </w:rPr>
+      </w:pPr>
+      <w:r>
+        <w:rPr>
+          <w:rFonts w:eastAsia="Arial"/>
+          <w:color w:val="auto"/>
           <w:sz w:val="22"/>
           <w:szCs w:val="22"/>
           <w:lang w:val="pt-PT"/>
@@ -14552,13 +14519,15 @@
         <w:contextualSpacing w:val="0"/>
         <w:jc w:val="left"/>
         <w:rPr>
+          <w:color w:val="auto"/>
           <w:lang w:val="pt-PT"/>
         </w:rPr>
       </w:pPr>
       <w:proofErr w:type="gramStart"/>
       <w:r>
         <w:rPr>
-          <w:rFonts w:ascii="Arial" w:eastAsia="Arial" w:hAnsi="Arial" w:cs="Arial"/>
+          <w:rFonts w:eastAsia="Arial"/>
+          <w:color w:val="auto"/>
           <w:sz w:val="22"/>
           <w:szCs w:val="22"/>
           <w:lang w:val="pt-PT"/>
@@ -14568,7 +14537,8 @@
       <w:proofErr w:type="spellStart"/>
       <w:r>
         <w:rPr>
-          <w:rFonts w:ascii="Arial" w:eastAsia="Arial" w:hAnsi="Arial" w:cs="Arial"/>
+          <w:rFonts w:eastAsia="Arial"/>
+          <w:color w:val="auto"/>
           <w:sz w:val="22"/>
           <w:szCs w:val="22"/>
           <w:lang w:val="pt-PT"/>
@@ -14579,7 +14549,8 @@
       <w:proofErr w:type="gramEnd"/>
       <w:r>
         <w:rPr>
-          <w:rFonts w:ascii="Arial" w:eastAsia="Arial" w:hAnsi="Arial" w:cs="Arial"/>
+          <w:rFonts w:eastAsia="Arial"/>
+          <w:color w:val="auto"/>
           <w:sz w:val="22"/>
           <w:szCs w:val="22"/>
           <w:lang w:val="pt-PT"/>
@@ -14589,7 +14560,8 @@
       <w:proofErr w:type="spellStart"/>
       <w:r>
         <w:rPr>
-          <w:rFonts w:ascii="Arial" w:eastAsia="Arial" w:hAnsi="Arial" w:cs="Arial"/>
+          <w:rFonts w:eastAsia="Arial"/>
+          <w:color w:val="auto"/>
           <w:sz w:val="22"/>
           <w:szCs w:val="22"/>
           <w:lang w:val="pt-PT"/>
@@ -14599,13 +14571,27 @@
       <w:proofErr w:type="spellEnd"/>
       <w:r>
         <w:rPr>
-          <w:rFonts w:ascii="Arial" w:eastAsia="Arial" w:hAnsi="Arial" w:cs="Arial"/>
+          <w:rFonts w:eastAsia="Arial"/>
+          <w:color w:val="auto"/>
           <w:sz w:val="22"/>
           <w:szCs w:val="22"/>
           <w:lang w:val="pt-PT"/>
         </w:rPr>
         <w:t>)</w:t>
       </w:r>
+    </w:p>
+    <w:p>
+      <w:pPr>
+        <w:pStyle w:val="PargrafodaLista"/>
+        <w:spacing w:before="40" w:after="40" w:line="240" w:lineRule="auto"/>
+        <w:ind w:firstLine="0"/>
+        <w:contextualSpacing w:val="0"/>
+        <w:jc w:val="left"/>
+        <w:rPr>
+          <w:color w:val="auto"/>
+          <w:lang w:val="pt-PT"/>
+        </w:rPr>
+      </w:pPr>
     </w:p>
     <w:p>
       <w:pPr>
@@ -14616,14 +14602,14 @@
           <w:sz w:val="24"/>
         </w:rPr>
       </w:pPr>
-      <w:bookmarkStart w:id="26" w:name="_Toc229562412"/>
+      <w:bookmarkStart w:id="25" w:name="_Toc229562412"/>
       <w:r>
         <w:rPr>
           <w:sz w:val="24"/>
         </w:rPr>
         <w:t>5 CONCLUSÃO</w:t>
       </w:r>
-      <w:bookmarkEnd w:id="26"/>
+      <w:bookmarkEnd w:id="25"/>
       <w:r>
         <w:rPr>
           <w:sz w:val="24"/>
@@ -14640,14 +14626,14 @@
           <w:sz w:val="24"/>
         </w:rPr>
       </w:pPr>
-      <w:bookmarkStart w:id="27" w:name="_Toc229562413"/>
+      <w:bookmarkStart w:id="26" w:name="_Toc229562413"/>
       <w:r>
         <w:rPr>
           <w:sz w:val="24"/>
         </w:rPr>
         <w:t>6 REFERÊNCIAS BIBLIOGRÁFICAS</w:t>
       </w:r>
-      <w:bookmarkEnd w:id="27"/>
+      <w:bookmarkEnd w:id="26"/>
       <w:r>
         <w:rPr>
           <w:sz w:val="24"/>
@@ -14816,7 +14802,7 @@
         <w:noProof/>
         <w:sz w:val="22"/>
       </w:rPr>
-      <w:t>20</w:t>
+      <w:t>10</w:t>
     </w:r>
     <w:r>
       <w:rPr>
@@ -17404,7 +17390,7 @@
 </file>
 
 <file path=customXml/itemProps1.xml><?xml version="1.0" encoding="utf-8"?>
-<ds:datastoreItem xmlns:ds="http://schemas.openxmlformats.org/officeDocument/2006/customXml" ds:itemID="{CFC703AC-E7B3-457B-99AE-40134726B147}">
+<ds:datastoreItem xmlns:ds="http://schemas.openxmlformats.org/officeDocument/2006/customXml" ds:itemID="{62D801EC-DA5D-4964-88D6-78290CA49D1A}">
   <ds:schemaRefs>
     <ds:schemaRef ds:uri="http://schemas.openxmlformats.org/officeDocument/2006/bibliography"/>
   </ds:schemaRefs>

</xml_diff>